<commit_message>
docs: atualiza docx, pdf e contrato de dados na branch main
</commit_message>
<xml_diff>
--- a/docs/Dashboard_Hydra_Documentacao.docx
+++ b/docs/Dashboard_Hydra_Documentacao.docx
@@ -2,7 +2,7 @@
 <file path=word/document.xml><?xml version="1.0" encoding="utf-8"?>
 <w:document xmlns:w="http://schemas.openxmlformats.org/wordprocessingml/2006/main" xmlns:m="http://schemas.openxmlformats.org/officeDocument/2006/math" xmlns:r="http://schemas.openxmlformats.org/officeDocument/2006/relationships" xmlns:o="urn:schemas-microsoft-com:office:office" xmlns:v="urn:schemas-microsoft-com:vml" xmlns:w10="urn:schemas-microsoft-com:office:word" xmlns:a="http://schemas.openxmlformats.org/drawingml/2006/main" xmlns:pic="http://schemas.openxmlformats.org/drawingml/2006/picture" xmlns:wp="http://schemas.openxmlformats.org/drawingml/2006/wordprocessingDrawing">
   <w:body>
-    <w:bookmarkStart w:id="32" w:name="dashboard-hydra-projeto-águas-vivas-ifsc"/>
+    <w:bookmarkStart w:id="36" w:name="dashboard-hydra-projeto-águas-vivas-ifsc"/>
     <w:p>
       <w:pPr>
         <w:pStyle w:val="Heading1"/>
@@ -542,7 +542,7 @@
       </w:r>
     </w:p>
     <w:bookmarkEnd w:id="26"/>
-    <w:bookmarkStart w:id="29" w:name="guia-de-instalação-e-uso"/>
+    <w:bookmarkStart w:id="30" w:name="guia-de-instalação-e-uso"/>
     <w:p>
       <w:pPr>
         <w:pStyle w:val="Heading2"/>
@@ -729,13 +729,13 @@
       </w:r>
     </w:p>
     <w:bookmarkEnd w:id="27"/>
-    <w:bookmarkStart w:id="28" w:name="acesso-administrativo"/>
+    <w:bookmarkStart w:id="29" w:name="X971b1202db3cc9b123c0b52505048caf6d69f6c"/>
     <w:p>
       <w:pPr>
         <w:pStyle w:val="Heading3"/>
       </w:pPr>
       <w:r>
-        <w:t xml:space="preserve">🔑 Acesso Administrativo</w:t>
+        <w:t xml:space="preserve">🔑 Acesso Administrativo e Criação do Primeiro Administrador</w:t>
       </w:r>
     </w:p>
     <w:p>
@@ -743,7 +743,86 @@
         <w:pStyle w:val="FirstParagraph"/>
       </w:pPr>
       <w:r>
-        <w:t xml:space="preserve">Após ligar o sistema pela primeira vez, acesse a área de administração abrindo o navegador no endereço:</w:t>
+        <w:t xml:space="preserve">Como o banco de dados novo vem zerado por padrão (sem registros na tabela</w:t>
+      </w:r>
+      <w:r>
+        <w:t xml:space="preserve"> </w:t>
+      </w:r>
+      <w:r>
+        <w:rPr>
+          <w:rStyle w:val="VerbatimChar"/>
+        </w:rPr>
+        <w:t xml:space="preserve">Usuario</w:t>
+      </w:r>
+      <w:r>
+        <w:t xml:space="preserve">), é necessário cadastrar o primeiro administrador antes de fazer o login.</w:t>
+      </w:r>
+    </w:p>
+    <w:p>
+      <w:pPr>
+        <w:pStyle w:val="BodyText"/>
+      </w:pPr>
+      <w:r>
+        <w:t xml:space="preserve">O projeto possui um script dedicado para a criação do administrador padrão:</w:t>
+      </w:r>
+      <w:r>
+        <w:t xml:space="preserve"> </w:t>
+      </w:r>
+      <w:r>
+        <w:t xml:space="preserve">*</w:t>
+      </w:r>
+      <w:r>
+        <w:t xml:space="preserve"> </w:t>
+      </w:r>
+      <w:r>
+        <w:rPr>
+          <w:bCs/>
+          <w:b/>
+        </w:rPr>
+        <w:t xml:space="preserve">E-mail padrão:</w:t>
+      </w:r>
+      <w:r>
+        <w:t xml:space="preserve"> </w:t>
+      </w:r>
+      <w:r>
+        <w:rPr>
+          <w:rStyle w:val="VerbatimChar"/>
+        </w:rPr>
+        <w:t xml:space="preserve">admin@hydra.local</w:t>
+      </w:r>
+      <w:r>
+        <w:t xml:space="preserve"> </w:t>
+      </w:r>
+      <w:r>
+        <w:t xml:space="preserve">*</w:t>
+      </w:r>
+      <w:r>
+        <w:t xml:space="preserve"> </w:t>
+      </w:r>
+      <w:r>
+        <w:rPr>
+          <w:bCs/>
+          <w:b/>
+        </w:rPr>
+        <w:t xml:space="preserve">Senha padrão:</w:t>
+      </w:r>
+      <w:r>
+        <w:t xml:space="preserve"> </w:t>
+      </w:r>
+      <w:r>
+        <w:rPr>
+          <w:rStyle w:val="VerbatimChar"/>
+        </w:rPr>
+        <w:t xml:space="preserve">admin123</w:t>
+      </w:r>
+    </w:p>
+    <w:bookmarkStart w:id="28" w:name="X23eaae1849d626ae69a000e0f23a8fff67763d7"/>
+    <w:p>
+      <w:pPr>
+        <w:pStyle w:val="Heading4"/>
+      </w:pPr>
+      <w:r>
+        <w:t xml:space="preserve">Como rodar o script de criação do administrador:</w:t>
       </w:r>
     </w:p>
     <w:p>
@@ -752,23 +831,67 @@
           <w:ilvl w:val="0"/>
           <w:numId w:val="1005"/>
         </w:numPr>
-        <w:pStyle w:val="Compact"/>
-      </w:pPr>
-      <w:r>
-        <w:rPr>
-          <w:bCs/>
-          <w:b/>
-        </w:rPr>
-        <w:t xml:space="preserve">URL:</w:t>
-      </w:r>
-      <w:r>
-        <w:t xml:space="preserve"> </w:t>
-      </w:r>
-      <w:r>
-        <w:rPr>
-          <w:rStyle w:val="VerbatimChar"/>
-        </w:rPr>
-        <w:t xml:space="preserve">http://localhost:3001</w:t>
+      </w:pPr>
+      <w:r>
+        <w:rPr>
+          <w:bCs/>
+          <w:b/>
+        </w:rPr>
+        <w:t xml:space="preserve">No ambiente Docker (Produção/Stack local):</w:t>
+      </w:r>
+      <w:r>
+        <w:t xml:space="preserve"> </w:t>
+      </w:r>
+      <w:r>
+        <w:t xml:space="preserve">Com a stack rodando, execute o comando a partir do terminal do hospedeiro:</w:t>
+      </w:r>
+      <w:r>
+        <w:t xml:space="preserve"> </w:t>
+      </w:r>
+      <w:r>
+        <w:rPr>
+          <w:rStyle w:val="VerbatimChar"/>
+        </w:rPr>
+        <w:t xml:space="preserve">bash     docker exec -it hydra_backend npx tsx src/createAdmin.ts</w:t>
+      </w:r>
+      <w:r>
+        <w:t xml:space="preserve"> </w:t>
+      </w:r>
+      <w:r>
+        <w:rPr>
+          <w:iCs/>
+          <w:i/>
+        </w:rPr>
+        <w:t xml:space="preserve">(Ou</w:t>
+      </w:r>
+      <w:r>
+        <w:rPr>
+          <w:iCs/>
+          <w:i/>
+        </w:rPr>
+        <w:t xml:space="preserve"> </w:t>
+      </w:r>
+      <w:r>
+        <w:rPr>
+          <w:rStyle w:val="VerbatimChar"/>
+          <w:iCs/>
+          <w:i/>
+        </w:rPr>
+        <w:t xml:space="preserve">docker compose exec backend npx tsx src/createAdmin.ts</w:t>
+      </w:r>
+      <w:r>
+        <w:rPr>
+          <w:iCs/>
+          <w:i/>
+        </w:rPr>
+        <w:t xml:space="preserve"> </w:t>
+      </w:r>
+      <w:r>
+        <w:rPr>
+          <w:iCs/>
+          <w:i/>
+        </w:rPr>
+        <w:t xml:space="preserve">a partir do diretório raiz).</w:t>
       </w:r>
     </w:p>
     <w:p>
@@ -777,48 +900,28 @@
           <w:ilvl w:val="0"/>
           <w:numId w:val="1005"/>
         </w:numPr>
-        <w:pStyle w:val="Compact"/>
-      </w:pPr>
-      <w:r>
-        <w:rPr>
-          <w:bCs/>
-          <w:b/>
-        </w:rPr>
-        <w:t xml:space="preserve">Login Padrão:</w:t>
-      </w:r>
-      <w:r>
-        <w:t xml:space="preserve"> </w:t>
-      </w:r>
-      <w:r>
-        <w:rPr>
-          <w:rStyle w:val="VerbatimChar"/>
-        </w:rPr>
-        <w:t xml:space="preserve">admin@hydra.local</w:t>
-      </w:r>
-    </w:p>
-    <w:p>
-      <w:pPr>
-        <w:numPr>
-          <w:ilvl w:val="0"/>
-          <w:numId w:val="1005"/>
-        </w:numPr>
-        <w:pStyle w:val="Compact"/>
-      </w:pPr>
-      <w:r>
-        <w:rPr>
-          <w:bCs/>
-          <w:b/>
-        </w:rPr>
-        <w:t xml:space="preserve">Senha Padrão:</w:t>
-      </w:r>
-      <w:r>
-        <w:t xml:space="preserve"> </w:t>
-      </w:r>
-      <w:r>
-        <w:rPr>
-          <w:rStyle w:val="VerbatimChar"/>
-        </w:rPr>
-        <w:t xml:space="preserve">admin123</w:t>
+      </w:pPr>
+      <w:r>
+        <w:rPr>
+          <w:bCs/>
+          <w:b/>
+        </w:rPr>
+        <w:t xml:space="preserve">No ambiente de Desenvolvimento Local (fora de container):</w:t>
+      </w:r>
+      <w:r>
+        <w:t xml:space="preserve"> </w:t>
+      </w:r>
+      <w:r>
+        <w:t xml:space="preserve">Com as dependências instaladas, vá até a pasta backend e execute:</w:t>
+      </w:r>
+      <w:r>
+        <w:t xml:space="preserve"> </w:t>
+      </w:r>
+      <w:r>
+        <w:rPr>
+          <w:rStyle w:val="VerbatimChar"/>
+        </w:rPr>
+        <w:t xml:space="preserve">bash     cd backend     npx tsx src/createAdmin.ts</w:t>
       </w:r>
     </w:p>
     <w:p>
@@ -826,46 +929,37 @@
         <w:pStyle w:val="FirstParagraph"/>
       </w:pPr>
       <w:r>
-        <w:rPr>
-          <w:iCs/>
-          <w:i/>
-        </w:rPr>
-        <w:t xml:space="preserve">(Recomenda-se alterar a senha imediatamente após o primeiro login na aba</w:t>
-      </w:r>
-      <w:r>
-        <w:rPr>
-          <w:iCs/>
-          <w:i/>
-        </w:rPr>
-        <w:t xml:space="preserve"> </w:t>
-      </w:r>
-      <w:r>
-        <w:rPr>
-          <w:iCs/>
-          <w:i/>
-        </w:rPr>
+        <w:t xml:space="preserve">Após executar o comando com sucesso, você poderá fazer o login utilizando as credenciais padrão em</w:t>
+      </w:r>
+      <w:r>
+        <w:t xml:space="preserve"> </w:t>
+      </w:r>
+      <w:r>
+        <w:rPr>
+          <w:rStyle w:val="VerbatimChar"/>
+        </w:rPr>
+        <w:t xml:space="preserve">http://localhost:3001</w:t>
+      </w:r>
+      <w:r>
+        <w:t xml:space="preserve"> </w:t>
+      </w:r>
+      <w:r>
+        <w:t xml:space="preserve">(ou na porta correspondente). Recomenda-se alterar a senha imediatamente na aba</w:t>
+      </w:r>
+      <w:r>
+        <w:t xml:space="preserve"> </w:t>
+      </w:r>
+      <w:r>
         <w:t xml:space="preserve">“</w:t>
       </w:r>
       <w:r>
-        <w:rPr>
-          <w:iCs/>
-          <w:i/>
-        </w:rPr>
         <w:t xml:space="preserve">Gerenciar Usuários</w:t>
       </w:r>
       <w:r>
-        <w:rPr>
-          <w:iCs/>
-          <w:i/>
-        </w:rPr>
         <w:t xml:space="preserve">”</w:t>
       </w:r>
       <w:r>
-        <w:rPr>
-          <w:iCs/>
-          <w:i/>
-        </w:rPr>
-        <w:t xml:space="preserve">.)</w:t>
+        <w:t xml:space="preserve">.</w:t>
       </w:r>
     </w:p>
     <w:p>
@@ -877,7 +971,8 @@
     </w:p>
     <w:bookmarkEnd w:id="28"/>
     <w:bookmarkEnd w:id="29"/>
-    <w:bookmarkStart w:id="31" w:name="X4408930317153d0e35112637b25c7148ffab589"/>
+    <w:bookmarkEnd w:id="30"/>
+    <w:bookmarkStart w:id="32" w:name="X4408930317153d0e35112637b25c7148ffab589"/>
     <w:p>
       <w:pPr>
         <w:pStyle w:val="Heading2"/>
@@ -1098,7 +1193,7 @@
         <w:t xml:space="preserve">npm run dev</w:t>
       </w:r>
     </w:p>
-    <w:bookmarkStart w:id="30" w:name="pontos-de-atenção"/>
+    <w:bookmarkStart w:id="31" w:name="pontos-de-atenção"/>
     <w:p>
       <w:pPr>
         <w:pStyle w:val="Heading3"/>
@@ -1264,27 +1359,1078 @@
         </w:pict>
       </w:r>
     </w:p>
-    <w:p>
-      <w:pPr>
-        <w:pStyle w:val="FirstParagraph"/>
-      </w:pPr>
-      <w:r>
-        <w:rPr>
-          <w:bCs/>
-          <w:b/>
-        </w:rPr>
-        <w:t xml:space="preserve">Instituto Federal de Santa Catarina — Campus Florianópolis</w:t>
-      </w:r>
-      <w:r>
-        <w:t xml:space="preserve"> </w:t>
-      </w:r>
-      <w:r>
-        <w:t xml:space="preserve">Curso de Engenharia Eletrônica — Projeto Integrador 2</w:t>
-      </w:r>
-    </w:p>
-    <w:bookmarkEnd w:id="30"/>
     <w:bookmarkEnd w:id="31"/>
     <w:bookmarkEnd w:id="32"/>
+    <w:bookmarkStart w:id="35" w:name="estrutura-e-ingestão-de-dados-mqtt-csv"/>
+    <w:p>
+      <w:pPr>
+        <w:pStyle w:val="Heading2"/>
+      </w:pPr>
+      <w:r>
+        <w:t xml:space="preserve">6. Estrutura e Ingestão de Dados (MQTT &amp; CSV)</w:t>
+      </w:r>
+    </w:p>
+    <w:p>
+      <w:pPr>
+        <w:pStyle w:val="FirstParagraph"/>
+      </w:pPr>
+      <w:r>
+        <w:t xml:space="preserve">O Dashboard Hydra aceita dados telemétricos via protocolo MQTT (em tempo real) ou via importação de arquivo CSV (em lote para histórico).</w:t>
+      </w:r>
+    </w:p>
+    <w:bookmarkStart w:id="33" w:name="payload-mqtt-tempo-real"/>
+    <w:p>
+      <w:pPr>
+        <w:pStyle w:val="Heading3"/>
+      </w:pPr>
+      <w:r>
+        <w:t xml:space="preserve">📡 6.1. Payload MQTT (Tempo Real)</w:t>
+      </w:r>
+    </w:p>
+    <w:p>
+      <w:pPr>
+        <w:pStyle w:val="FirstParagraph"/>
+      </w:pPr>
+      <w:r>
+        <w:t xml:space="preserve">A boia/hardware deve publicar mensagens em formato JSON no tópico</w:t>
+      </w:r>
+      <w:r>
+        <w:t xml:space="preserve"> </w:t>
+      </w:r>
+      <w:r>
+        <w:rPr>
+          <w:rStyle w:val="VerbatimChar"/>
+        </w:rPr>
+        <w:t xml:space="preserve">Hydra/&lt;boia_id&gt;</w:t>
+      </w:r>
+      <w:r>
+        <w:t xml:space="preserve"> </w:t>
+      </w:r>
+      <w:r>
+        <w:t xml:space="preserve">(onde</w:t>
+      </w:r>
+      <w:r>
+        <w:t xml:space="preserve"> </w:t>
+      </w:r>
+      <w:r>
+        <w:rPr>
+          <w:rStyle w:val="VerbatimChar"/>
+        </w:rPr>
+        <w:t xml:space="preserve">&lt;boia_id&gt;</w:t>
+      </w:r>
+      <w:r>
+        <w:t xml:space="preserve"> </w:t>
+      </w:r>
+      <w:r>
+        <w:t xml:space="preserve">é o identificador único da boia cadastrada, em letras minúsculas, ex:</w:t>
+      </w:r>
+      <w:r>
+        <w:t xml:space="preserve"> </w:t>
+      </w:r>
+      <w:r>
+        <w:rPr>
+          <w:rStyle w:val="VerbatimChar"/>
+        </w:rPr>
+        <w:t xml:space="preserve">boia_01</w:t>
+      </w:r>
+      <w:r>
+        <w:t xml:space="preserve">).</w:t>
+      </w:r>
+    </w:p>
+    <w:p>
+      <w:pPr>
+        <w:pStyle w:val="BodyText"/>
+      </w:pPr>
+      <w:r>
+        <w:rPr>
+          <w:bCs/>
+          <w:b/>
+        </w:rPr>
+        <w:t xml:space="preserve">Estrutura do JSON do Payload:</w:t>
+      </w:r>
+    </w:p>
+    <w:p>
+      <w:pPr>
+        <w:pStyle w:val="SourceCode"/>
+      </w:pPr>
+      <w:r>
+        <w:rPr>
+          <w:rStyle w:val="FunctionTok"/>
+        </w:rPr>
+        <w:t xml:space="preserve">{</w:t>
+      </w:r>
+      <w:r>
+        <w:br/>
+      </w:r>
+      <w:r>
+        <w:rPr>
+          <w:rStyle w:val="NormalTok"/>
+        </w:rPr>
+        <w:t xml:space="preserve">  </w:t>
+      </w:r>
+      <w:r>
+        <w:rPr>
+          <w:rStyle w:val="DataTypeTok"/>
+        </w:rPr>
+        <w:t xml:space="preserve">"timestamp"</w:t>
+      </w:r>
+      <w:r>
+        <w:rPr>
+          <w:rStyle w:val="FunctionTok"/>
+        </w:rPr>
+        <w:t xml:space="preserve">:</w:t>
+      </w:r>
+      <w:r>
+        <w:rPr>
+          <w:rStyle w:val="NormalTok"/>
+        </w:rPr>
+        <w:t xml:space="preserve"> </w:t>
+      </w:r>
+      <w:r>
+        <w:rPr>
+          <w:rStyle w:val="StringTok"/>
+        </w:rPr>
+        <w:t xml:space="preserve">"2026-06-02 16:25"</w:t>
+      </w:r>
+      <w:r>
+        <w:rPr>
+          <w:rStyle w:val="FunctionTok"/>
+        </w:rPr>
+        <w:t xml:space="preserve">,</w:t>
+      </w:r>
+      <w:r>
+        <w:br/>
+      </w:r>
+      <w:r>
+        <w:rPr>
+          <w:rStyle w:val="NormalTok"/>
+        </w:rPr>
+        <w:t xml:space="preserve">  </w:t>
+      </w:r>
+      <w:r>
+        <w:rPr>
+          <w:rStyle w:val="DataTypeTok"/>
+        </w:rPr>
+        <w:t xml:space="preserve">"lat"</w:t>
+      </w:r>
+      <w:r>
+        <w:rPr>
+          <w:rStyle w:val="FunctionTok"/>
+        </w:rPr>
+        <w:t xml:space="preserve">:</w:t>
+      </w:r>
+      <w:r>
+        <w:rPr>
+          <w:rStyle w:val="NormalTok"/>
+        </w:rPr>
+        <w:t xml:space="preserve"> </w:t>
+      </w:r>
+      <w:r>
+        <w:rPr>
+          <w:rStyle w:val="FloatTok"/>
+        </w:rPr>
+        <w:t xml:space="preserve">-27.593708</w:t>
+      </w:r>
+      <w:r>
+        <w:rPr>
+          <w:rStyle w:val="FunctionTok"/>
+        </w:rPr>
+        <w:t xml:space="preserve">,</w:t>
+      </w:r>
+      <w:r>
+        <w:br/>
+      </w:r>
+      <w:r>
+        <w:rPr>
+          <w:rStyle w:val="NormalTok"/>
+        </w:rPr>
+        <w:t xml:space="preserve">  </w:t>
+      </w:r>
+      <w:r>
+        <w:rPr>
+          <w:rStyle w:val="DataTypeTok"/>
+        </w:rPr>
+        <w:t xml:space="preserve">"lon"</w:t>
+      </w:r>
+      <w:r>
+        <w:rPr>
+          <w:rStyle w:val="FunctionTok"/>
+        </w:rPr>
+        <w:t xml:space="preserve">:</w:t>
+      </w:r>
+      <w:r>
+        <w:rPr>
+          <w:rStyle w:val="NormalTok"/>
+        </w:rPr>
+        <w:t xml:space="preserve"> </w:t>
+      </w:r>
+      <w:r>
+        <w:rPr>
+          <w:rStyle w:val="FloatTok"/>
+        </w:rPr>
+        <w:t xml:space="preserve">-48.542835</w:t>
+      </w:r>
+      <w:r>
+        <w:rPr>
+          <w:rStyle w:val="FunctionTok"/>
+        </w:rPr>
+        <w:t xml:space="preserve">,</w:t>
+      </w:r>
+      <w:r>
+        <w:br/>
+      </w:r>
+      <w:r>
+        <w:rPr>
+          <w:rStyle w:val="NormalTok"/>
+        </w:rPr>
+        <w:t xml:space="preserve">  </w:t>
+      </w:r>
+      <w:r>
+        <w:rPr>
+          <w:rStyle w:val="DataTypeTok"/>
+        </w:rPr>
+        <w:t xml:space="preserve">"alt"</w:t>
+      </w:r>
+      <w:r>
+        <w:rPr>
+          <w:rStyle w:val="FunctionTok"/>
+        </w:rPr>
+        <w:t xml:space="preserve">:</w:t>
+      </w:r>
+      <w:r>
+        <w:rPr>
+          <w:rStyle w:val="NormalTok"/>
+        </w:rPr>
+        <w:t xml:space="preserve"> </w:t>
+      </w:r>
+      <w:r>
+        <w:rPr>
+          <w:rStyle w:val="FloatTok"/>
+        </w:rPr>
+        <w:t xml:space="preserve">16.6</w:t>
+      </w:r>
+      <w:r>
+        <w:rPr>
+          <w:rStyle w:val="FunctionTok"/>
+        </w:rPr>
+        <w:t xml:space="preserve">,</w:t>
+      </w:r>
+      <w:r>
+        <w:br/>
+      </w:r>
+      <w:r>
+        <w:rPr>
+          <w:rStyle w:val="NormalTok"/>
+        </w:rPr>
+        <w:t xml:space="preserve">  </w:t>
+      </w:r>
+      <w:r>
+        <w:rPr>
+          <w:rStyle w:val="DataTypeTok"/>
+        </w:rPr>
+        <w:t xml:space="preserve">"tempAr"</w:t>
+      </w:r>
+      <w:r>
+        <w:rPr>
+          <w:rStyle w:val="FunctionTok"/>
+        </w:rPr>
+        <w:t xml:space="preserve">:</w:t>
+      </w:r>
+      <w:r>
+        <w:rPr>
+          <w:rStyle w:val="NormalTok"/>
+        </w:rPr>
+        <w:t xml:space="preserve"> </w:t>
+      </w:r>
+      <w:r>
+        <w:rPr>
+          <w:rStyle w:val="FloatTok"/>
+        </w:rPr>
+        <w:t xml:space="preserve">25.3</w:t>
+      </w:r>
+      <w:r>
+        <w:rPr>
+          <w:rStyle w:val="FunctionTok"/>
+        </w:rPr>
+        <w:t xml:space="preserve">,</w:t>
+      </w:r>
+      <w:r>
+        <w:br/>
+      </w:r>
+      <w:r>
+        <w:rPr>
+          <w:rStyle w:val="NormalTok"/>
+        </w:rPr>
+        <w:t xml:space="preserve">  </w:t>
+      </w:r>
+      <w:r>
+        <w:rPr>
+          <w:rStyle w:val="DataTypeTok"/>
+        </w:rPr>
+        <w:t xml:space="preserve">"umidAr"</w:t>
+      </w:r>
+      <w:r>
+        <w:rPr>
+          <w:rStyle w:val="FunctionTok"/>
+        </w:rPr>
+        <w:t xml:space="preserve">:</w:t>
+      </w:r>
+      <w:r>
+        <w:rPr>
+          <w:rStyle w:val="NormalTok"/>
+        </w:rPr>
+        <w:t xml:space="preserve"> </w:t>
+      </w:r>
+      <w:r>
+        <w:rPr>
+          <w:rStyle w:val="DecValTok"/>
+        </w:rPr>
+        <w:t xml:space="preserve">70</w:t>
+      </w:r>
+      <w:r>
+        <w:rPr>
+          <w:rStyle w:val="FunctionTok"/>
+        </w:rPr>
+        <w:t xml:space="preserve">,</w:t>
+      </w:r>
+      <w:r>
+        <w:br/>
+      </w:r>
+      <w:r>
+        <w:rPr>
+          <w:rStyle w:val="NormalTok"/>
+        </w:rPr>
+        <w:t xml:space="preserve">  </w:t>
+      </w:r>
+      <w:r>
+        <w:rPr>
+          <w:rStyle w:val="DataTypeTok"/>
+        </w:rPr>
+        <w:t xml:space="preserve">"pressao"</w:t>
+      </w:r>
+      <w:r>
+        <w:rPr>
+          <w:rStyle w:val="FunctionTok"/>
+        </w:rPr>
+        <w:t xml:space="preserve">:</w:t>
+      </w:r>
+      <w:r>
+        <w:rPr>
+          <w:rStyle w:val="NormalTok"/>
+        </w:rPr>
+        <w:t xml:space="preserve"> </w:t>
+      </w:r>
+      <w:r>
+        <w:rPr>
+          <w:rStyle w:val="DecValTok"/>
+        </w:rPr>
+        <w:t xml:space="preserve">1012</w:t>
+      </w:r>
+      <w:r>
+        <w:rPr>
+          <w:rStyle w:val="FunctionTok"/>
+        </w:rPr>
+        <w:t xml:space="preserve">,</w:t>
+      </w:r>
+      <w:r>
+        <w:br/>
+      </w:r>
+      <w:r>
+        <w:rPr>
+          <w:rStyle w:val="NormalTok"/>
+        </w:rPr>
+        <w:t xml:space="preserve">  </w:t>
+      </w:r>
+      <w:r>
+        <w:rPr>
+          <w:rStyle w:val="DataTypeTok"/>
+        </w:rPr>
+        <w:t xml:space="preserve">"indiceUV"</w:t>
+      </w:r>
+      <w:r>
+        <w:rPr>
+          <w:rStyle w:val="FunctionTok"/>
+        </w:rPr>
+        <w:t xml:space="preserve">:</w:t>
+      </w:r>
+      <w:r>
+        <w:rPr>
+          <w:rStyle w:val="NormalTok"/>
+        </w:rPr>
+        <w:t xml:space="preserve"> </w:t>
+      </w:r>
+      <w:r>
+        <w:rPr>
+          <w:rStyle w:val="DecValTok"/>
+        </w:rPr>
+        <w:t xml:space="preserve">5</w:t>
+      </w:r>
+      <w:r>
+        <w:rPr>
+          <w:rStyle w:val="FunctionTok"/>
+        </w:rPr>
+        <w:t xml:space="preserve">,</w:t>
+      </w:r>
+      <w:r>
+        <w:br/>
+      </w:r>
+      <w:r>
+        <w:rPr>
+          <w:rStyle w:val="NormalTok"/>
+        </w:rPr>
+        <w:t xml:space="preserve">  </w:t>
+      </w:r>
+      <w:r>
+        <w:rPr>
+          <w:rStyle w:val="DataTypeTok"/>
+        </w:rPr>
+        <w:t xml:space="preserve">"chuvaAcum"</w:t>
+      </w:r>
+      <w:r>
+        <w:rPr>
+          <w:rStyle w:val="FunctionTok"/>
+        </w:rPr>
+        <w:t xml:space="preserve">:</w:t>
+      </w:r>
+      <w:r>
+        <w:rPr>
+          <w:rStyle w:val="NormalTok"/>
+        </w:rPr>
+        <w:t xml:space="preserve"> </w:t>
+      </w:r>
+      <w:r>
+        <w:rPr>
+          <w:rStyle w:val="DecValTok"/>
+        </w:rPr>
+        <w:t xml:space="preserve">0</w:t>
+      </w:r>
+      <w:r>
+        <w:rPr>
+          <w:rStyle w:val="FunctionTok"/>
+        </w:rPr>
+        <w:t xml:space="preserve">,</w:t>
+      </w:r>
+      <w:r>
+        <w:br/>
+      </w:r>
+      <w:r>
+        <w:rPr>
+          <w:rStyle w:val="NormalTok"/>
+        </w:rPr>
+        <w:t xml:space="preserve">  </w:t>
+      </w:r>
+      <w:r>
+        <w:rPr>
+          <w:rStyle w:val="DataTypeTok"/>
+        </w:rPr>
+        <w:t xml:space="preserve">"ventoVel"</w:t>
+      </w:r>
+      <w:r>
+        <w:rPr>
+          <w:rStyle w:val="FunctionTok"/>
+        </w:rPr>
+        <w:t xml:space="preserve">:</w:t>
+      </w:r>
+      <w:r>
+        <w:rPr>
+          <w:rStyle w:val="NormalTok"/>
+        </w:rPr>
+        <w:t xml:space="preserve"> </w:t>
+      </w:r>
+      <w:r>
+        <w:rPr>
+          <w:rStyle w:val="DecValTok"/>
+        </w:rPr>
+        <w:t xml:space="preserve">12</w:t>
+      </w:r>
+      <w:r>
+        <w:rPr>
+          <w:rStyle w:val="FunctionTok"/>
+        </w:rPr>
+        <w:t xml:space="preserve">,</w:t>
+      </w:r>
+      <w:r>
+        <w:br/>
+      </w:r>
+      <w:r>
+        <w:rPr>
+          <w:rStyle w:val="NormalTok"/>
+        </w:rPr>
+        <w:t xml:space="preserve">  </w:t>
+      </w:r>
+      <w:r>
+        <w:rPr>
+          <w:rStyle w:val="DataTypeTok"/>
+        </w:rPr>
+        <w:t xml:space="preserve">"ventoDir"</w:t>
+      </w:r>
+      <w:r>
+        <w:rPr>
+          <w:rStyle w:val="FunctionTok"/>
+        </w:rPr>
+        <w:t xml:space="preserve">:</w:t>
+      </w:r>
+      <w:r>
+        <w:rPr>
+          <w:rStyle w:val="NormalTok"/>
+        </w:rPr>
+        <w:t xml:space="preserve"> </w:t>
+      </w:r>
+      <w:r>
+        <w:rPr>
+          <w:rStyle w:val="DecValTok"/>
+        </w:rPr>
+        <w:t xml:space="preserve">180</w:t>
+      </w:r>
+      <w:r>
+        <w:rPr>
+          <w:rStyle w:val="FunctionTok"/>
+        </w:rPr>
+        <w:t xml:space="preserve">,</w:t>
+      </w:r>
+      <w:r>
+        <w:br/>
+      </w:r>
+      <w:r>
+        <w:rPr>
+          <w:rStyle w:val="NormalTok"/>
+        </w:rPr>
+        <w:t xml:space="preserve">  </w:t>
+      </w:r>
+      <w:r>
+        <w:rPr>
+          <w:rStyle w:val="DataTypeTok"/>
+        </w:rPr>
+        <w:t xml:space="preserve">"tempAgua"</w:t>
+      </w:r>
+      <w:r>
+        <w:rPr>
+          <w:rStyle w:val="FunctionTok"/>
+        </w:rPr>
+        <w:t xml:space="preserve">:</w:t>
+      </w:r>
+      <w:r>
+        <w:rPr>
+          <w:rStyle w:val="NormalTok"/>
+        </w:rPr>
+        <w:t xml:space="preserve"> </w:t>
+      </w:r>
+      <w:r>
+        <w:rPr>
+          <w:rStyle w:val="FloatTok"/>
+        </w:rPr>
+        <w:t xml:space="preserve">22.1</w:t>
+      </w:r>
+      <w:r>
+        <w:rPr>
+          <w:rStyle w:val="FunctionTok"/>
+        </w:rPr>
+        <w:t xml:space="preserve">,</w:t>
+      </w:r>
+      <w:r>
+        <w:br/>
+      </w:r>
+      <w:r>
+        <w:rPr>
+          <w:rStyle w:val="NormalTok"/>
+        </w:rPr>
+        <w:t xml:space="preserve">  </w:t>
+      </w:r>
+      <w:r>
+        <w:rPr>
+          <w:rStyle w:val="DataTypeTok"/>
+        </w:rPr>
+        <w:t xml:space="preserve">"phAgua"</w:t>
+      </w:r>
+      <w:r>
+        <w:rPr>
+          <w:rStyle w:val="FunctionTok"/>
+        </w:rPr>
+        <w:t xml:space="preserve">:</w:t>
+      </w:r>
+      <w:r>
+        <w:rPr>
+          <w:rStyle w:val="NormalTok"/>
+        </w:rPr>
+        <w:t xml:space="preserve"> </w:t>
+      </w:r>
+      <w:r>
+        <w:rPr>
+          <w:rStyle w:val="FloatTok"/>
+        </w:rPr>
+        <w:t xml:space="preserve">7.2</w:t>
+      </w:r>
+      <w:r>
+        <w:rPr>
+          <w:rStyle w:val="FunctionTok"/>
+        </w:rPr>
+        <w:t xml:space="preserve">,</w:t>
+      </w:r>
+      <w:r>
+        <w:br/>
+      </w:r>
+      <w:r>
+        <w:rPr>
+          <w:rStyle w:val="NormalTok"/>
+        </w:rPr>
+        <w:t xml:space="preserve">  </w:t>
+      </w:r>
+      <w:r>
+        <w:rPr>
+          <w:rStyle w:val="DataTypeTok"/>
+        </w:rPr>
+        <w:t xml:space="preserve">"condutivEC"</w:t>
+      </w:r>
+      <w:r>
+        <w:rPr>
+          <w:rStyle w:val="FunctionTok"/>
+        </w:rPr>
+        <w:t xml:space="preserve">:</w:t>
+      </w:r>
+      <w:r>
+        <w:rPr>
+          <w:rStyle w:val="NormalTok"/>
+        </w:rPr>
+        <w:t xml:space="preserve"> </w:t>
+      </w:r>
+      <w:r>
+        <w:rPr>
+          <w:rStyle w:val="DecValTok"/>
+        </w:rPr>
+        <w:t xml:space="preserve">980</w:t>
+      </w:r>
+      <w:r>
+        <w:rPr>
+          <w:rStyle w:val="FunctionTok"/>
+        </w:rPr>
+        <w:t xml:space="preserve">,</w:t>
+      </w:r>
+      <w:r>
+        <w:br/>
+      </w:r>
+      <w:r>
+        <w:rPr>
+          <w:rStyle w:val="NormalTok"/>
+        </w:rPr>
+        <w:t xml:space="preserve">  </w:t>
+      </w:r>
+      <w:r>
+        <w:rPr>
+          <w:rStyle w:val="DataTypeTok"/>
+        </w:rPr>
+        <w:t xml:space="preserve">"turbidez"</w:t>
+      </w:r>
+      <w:r>
+        <w:rPr>
+          <w:rStyle w:val="FunctionTok"/>
+        </w:rPr>
+        <w:t xml:space="preserve">:</w:t>
+      </w:r>
+      <w:r>
+        <w:rPr>
+          <w:rStyle w:val="NormalTok"/>
+        </w:rPr>
+        <w:t xml:space="preserve"> </w:t>
+      </w:r>
+      <w:r>
+        <w:rPr>
+          <w:rStyle w:val="DecValTok"/>
+        </w:rPr>
+        <w:t xml:space="preserve">12</w:t>
+      </w:r>
+      <w:r>
+        <w:br/>
+      </w:r>
+      <w:r>
+        <w:rPr>
+          <w:rStyle w:val="FunctionTok"/>
+        </w:rPr>
+        <w:t xml:space="preserve">}</w:t>
+      </w:r>
+    </w:p>
+    <w:p>
+      <w:pPr>
+        <w:numPr>
+          <w:ilvl w:val="0"/>
+          <w:numId w:val="1010"/>
+        </w:numPr>
+        <w:pStyle w:val="Compact"/>
+      </w:pPr>
+      <w:r>
+        <w:rPr>
+          <w:bCs/>
+          <w:b/>
+        </w:rPr>
+        <w:t xml:space="preserve">Tópico:</w:t>
+      </w:r>
+      <w:r>
+        <w:t xml:space="preserve"> </w:t>
+      </w:r>
+      <w:r>
+        <w:rPr>
+          <w:rStyle w:val="VerbatimChar"/>
+        </w:rPr>
+        <w:t xml:space="preserve">Hydra/&lt;boia_id&gt;</w:t>
+      </w:r>
+    </w:p>
+    <w:p>
+      <w:pPr>
+        <w:numPr>
+          <w:ilvl w:val="0"/>
+          <w:numId w:val="1010"/>
+        </w:numPr>
+        <w:pStyle w:val="Compact"/>
+      </w:pPr>
+      <w:r>
+        <w:rPr>
+          <w:bCs/>
+          <w:b/>
+        </w:rPr>
+        <w:t xml:space="preserve">Campos de geolocalização (</w:t>
+      </w:r>
+      <w:r>
+        <w:rPr>
+          <w:rStyle w:val="VerbatimChar"/>
+          <w:bCs/>
+          <w:b/>
+        </w:rPr>
+        <w:t xml:space="preserve">lat</w:t>
+      </w:r>
+      <w:r>
+        <w:rPr>
+          <w:bCs/>
+          <w:b/>
+        </w:rPr>
+        <w:t xml:space="preserve">,</w:t>
+      </w:r>
+      <w:r>
+        <w:rPr>
+          <w:bCs/>
+          <w:b/>
+        </w:rPr>
+        <w:t xml:space="preserve"> </w:t>
+      </w:r>
+      <w:r>
+        <w:rPr>
+          <w:rStyle w:val="VerbatimChar"/>
+          <w:bCs/>
+          <w:b/>
+        </w:rPr>
+        <w:t xml:space="preserve">lon</w:t>
+      </w:r>
+      <w:r>
+        <w:rPr>
+          <w:bCs/>
+          <w:b/>
+        </w:rPr>
+        <w:t xml:space="preserve">,</w:t>
+      </w:r>
+      <w:r>
+        <w:rPr>
+          <w:bCs/>
+          <w:b/>
+        </w:rPr>
+        <w:t xml:space="preserve"> </w:t>
+      </w:r>
+      <w:r>
+        <w:rPr>
+          <w:rStyle w:val="VerbatimChar"/>
+          <w:bCs/>
+          <w:b/>
+        </w:rPr>
+        <w:t xml:space="preserve">alt</w:t>
+      </w:r>
+      <w:r>
+        <w:rPr>
+          <w:bCs/>
+          <w:b/>
+        </w:rPr>
+        <w:t xml:space="preserve">):</w:t>
+      </w:r>
+      <w:r>
+        <w:t xml:space="preserve"> </w:t>
+      </w:r>
+      <w:r>
+        <w:t xml:space="preserve">Opcionais. Se enviados, a posição geográfica da boia será atualizada no mapa.</w:t>
+      </w:r>
+    </w:p>
+    <w:p>
+      <w:pPr>
+        <w:numPr>
+          <w:ilvl w:val="0"/>
+          <w:numId w:val="1010"/>
+        </w:numPr>
+        <w:pStyle w:val="Compact"/>
+      </w:pPr>
+      <w:r>
+        <w:rPr>
+          <w:bCs/>
+          <w:b/>
+        </w:rPr>
+        <w:t xml:space="preserve">Campos de Sensores:</w:t>
+      </w:r>
+      <w:r>
+        <w:t xml:space="preserve"> </w:t>
+      </w:r>
+      <w:r>
+        <w:t xml:space="preserve">Todos os valores numéricos são opcionais no JSON do payload (mas devem ser declarados com o tipo correto). Valores ausentes ou nulos não sobrescreverão as leituras passadas, a menos que especificado.</w:t>
+      </w:r>
+    </w:p>
+    <w:p>
+      <w:r>
+        <w:pict>
+          <v:rect style="width:0;height:1.5pt" o:hralign="center" o:hrstd="t" o:hr="t"/>
+        </w:pict>
+      </w:r>
+    </w:p>
+    <w:bookmarkEnd w:id="33"/>
+    <w:bookmarkStart w:id="34" w:name="estrutura-de-importação-csv-lote"/>
+    <w:p>
+      <w:pPr>
+        <w:pStyle w:val="Heading3"/>
+      </w:pPr>
+      <w:r>
+        <w:t xml:space="preserve">📂 6.2. Estrutura de Importação CSV (Lote)</w:t>
+      </w:r>
+    </w:p>
+    <w:p>
+      <w:pPr>
+        <w:pStyle w:val="FirstParagraph"/>
+      </w:pPr>
+      <w:r>
+        <w:t xml:space="preserve">Na área administrativa de cada boia, é possível fazer o upload de arquivos CSV contendo o histórico de leituras.</w:t>
+      </w:r>
+    </w:p>
+    <w:p>
+      <w:pPr>
+        <w:numPr>
+          <w:ilvl w:val="0"/>
+          <w:numId w:val="1011"/>
+        </w:numPr>
+        <w:pStyle w:val="Compact"/>
+      </w:pPr>
+      <w:r>
+        <w:rPr>
+          <w:bCs/>
+          <w:b/>
+        </w:rPr>
+        <w:t xml:space="preserve">Separador:</w:t>
+      </w:r>
+      <w:r>
+        <w:t xml:space="preserve"> </w:t>
+      </w:r>
+      <w:r>
+        <w:t xml:space="preserve">Ponto e vírgula (</w:t>
+      </w:r>
+      <w:r>
+        <w:rPr>
+          <w:rStyle w:val="VerbatimChar"/>
+        </w:rPr>
+        <w:t xml:space="preserve">;</w:t>
+      </w:r>
+      <w:r>
+        <w:t xml:space="preserve">).</w:t>
+      </w:r>
+    </w:p>
+    <w:p>
+      <w:pPr>
+        <w:numPr>
+          <w:ilvl w:val="0"/>
+          <w:numId w:val="1011"/>
+        </w:numPr>
+        <w:pStyle w:val="Compact"/>
+      </w:pPr>
+      <w:r>
+        <w:rPr>
+          <w:bCs/>
+          <w:b/>
+        </w:rPr>
+        <w:t xml:space="preserve">Codificação:</w:t>
+      </w:r>
+      <w:r>
+        <w:t xml:space="preserve"> </w:t>
+      </w:r>
+      <w:r>
+        <w:t xml:space="preserve">UTF-8.</w:t>
+      </w:r>
+    </w:p>
+    <w:p>
+      <w:pPr>
+        <w:numPr>
+          <w:ilvl w:val="0"/>
+          <w:numId w:val="1011"/>
+        </w:numPr>
+        <w:pStyle w:val="Compact"/>
+      </w:pPr>
+      <w:r>
+        <w:rPr>
+          <w:bCs/>
+          <w:b/>
+        </w:rPr>
+        <w:t xml:space="preserve">Cabeçalho obrigatório (Primeira Linha):</w:t>
+      </w:r>
+      <w:r>
+        <w:t xml:space="preserve"> </w:t>
+      </w:r>
+      <w:r>
+        <w:rPr>
+          <w:rStyle w:val="VerbatimChar"/>
+        </w:rPr>
+        <w:t xml:space="preserve">csv     timestamp;tempAr;umidAr;pressao;indiceUV;chuvaAcum;ventoVel;ventoDir;tempAgua;phAgua;condutivEC;turbidez</w:t>
+      </w:r>
+    </w:p>
+    <w:p>
+      <w:pPr>
+        <w:pStyle w:val="FirstParagraph"/>
+      </w:pPr>
+      <w:r>
+        <w:rPr>
+          <w:bCs/>
+          <w:b/>
+        </w:rPr>
+        <w:t xml:space="preserve">Exemplo de conteúdo de arquivo CSV (</w:t>
+      </w:r>
+      <w:r>
+        <w:rPr>
+          <w:rStyle w:val="VerbatimChar"/>
+          <w:bCs/>
+          <w:b/>
+        </w:rPr>
+        <w:t xml:space="preserve">dados.csv</w:t>
+      </w:r>
+      <w:r>
+        <w:rPr>
+          <w:bCs/>
+          <w:b/>
+        </w:rPr>
+        <w:t xml:space="preserve">):</w:t>
+      </w:r>
+    </w:p>
+    <w:p>
+      <w:pPr>
+        <w:pStyle w:val="SourceCode"/>
+      </w:pPr>
+      <w:r>
+        <w:rPr>
+          <w:rStyle w:val="VerbatimChar"/>
+        </w:rPr>
+        <w:t xml:space="preserve">timestamp;tempAr;umidAr;pressao;indiceUV;chuvaAcum;ventoVel;ventoDir;tempAgua;phAgua;condutivEC;turbidez</w:t>
+      </w:r>
+      <w:r>
+        <w:br/>
+      </w:r>
+      <w:r>
+        <w:rPr>
+          <w:rStyle w:val="VerbatimChar"/>
+        </w:rPr>
+        <w:t xml:space="preserve">2026-05-01 10:00;25.3;70;1012;5;0;12;180;22.1;7.2;980;12</w:t>
+      </w:r>
+      <w:r>
+        <w:br/>
+      </w:r>
+      <w:r>
+        <w:rPr>
+          <w:rStyle w:val="VerbatimChar"/>
+        </w:rPr>
+        <w:t xml:space="preserve">2026-05-01 10:15;25.1;72;1011.8;4;0;11;175;22.0;7.1;978;13</w:t>
+      </w:r>
+      <w:r>
+        <w:br/>
+      </w:r>
+      <w:r>
+        <w:rPr>
+          <w:rStyle w:val="VerbatimChar"/>
+        </w:rPr>
+        <w:t xml:space="preserve">2026-05-01 10:30;24.9;75;1011.5;4;0.2;14;190;21.9;7.2;982;12</w:t>
+      </w:r>
+    </w:p>
+    <w:p>
+      <w:pPr>
+        <w:pStyle w:val="BlockText"/>
+      </w:pPr>
+      <w:r>
+        <w:t xml:space="preserve">[!IMPORTANT]</w:t>
+      </w:r>
+      <w:r>
+        <w:t xml:space="preserve"> </w:t>
+      </w:r>
+      <w:r>
+        <w:t xml:space="preserve">O formato da data e hora (</w:t>
+      </w:r>
+      <w:r>
+        <w:rPr>
+          <w:rStyle w:val="VerbatimChar"/>
+        </w:rPr>
+        <w:t xml:space="preserve">timestamp</w:t>
+      </w:r>
+      <w:r>
+        <w:t xml:space="preserve">) deve seguir o padrão</w:t>
+      </w:r>
+      <w:r>
+        <w:t xml:space="preserve"> </w:t>
+      </w:r>
+      <w:r>
+        <w:rPr>
+          <w:rStyle w:val="VerbatimChar"/>
+        </w:rPr>
+        <w:t xml:space="preserve">YYYY-MM-DD HH:MM</w:t>
+      </w:r>
+      <w:r>
+        <w:t xml:space="preserve"> </w:t>
+      </w:r>
+      <w:r>
+        <w:t xml:space="preserve">(ex:</w:t>
+      </w:r>
+      <w:r>
+        <w:t xml:space="preserve"> </w:t>
+      </w:r>
+      <w:r>
+        <w:rPr>
+          <w:rStyle w:val="VerbatimChar"/>
+        </w:rPr>
+        <w:t xml:space="preserve">2026-05-01 10:00</w:t>
+      </w:r>
+      <w:r>
+        <w:t xml:space="preserve">) ou padrão ISO 8601 correspondente. Valores decimais nos sensores devem utilizar o caractere de ponto (</w:t>
+      </w:r>
+      <w:r>
+        <w:rPr>
+          <w:rStyle w:val="VerbatimChar"/>
+        </w:rPr>
+        <w:t xml:space="preserve">.</w:t>
+      </w:r>
+      <w:r>
+        <w:t xml:space="preserve">) como separador decimal.</w:t>
+      </w:r>
+    </w:p>
+    <w:p>
+      <w:r>
+        <w:pict>
+          <v:rect style="width:0;height:1.5pt" o:hralign="center" o:hrstd="t" o:hr="t"/>
+        </w:pict>
+      </w:r>
+    </w:p>
+    <w:p>
+      <w:pPr>
+        <w:pStyle w:val="FirstParagraph"/>
+      </w:pPr>
+      <w:r>
+        <w:rPr>
+          <w:bCs/>
+          <w:b/>
+        </w:rPr>
+        <w:t xml:space="preserve">Instituto Federal de Santa Catarina — Campus Florianópolis</w:t>
+      </w:r>
+      <w:r>
+        <w:t xml:space="preserve"> </w:t>
+      </w:r>
+      <w:r>
+        <w:t xml:space="preserve">Curso de Engenharia Eletrônica — Projeto Integrador 2</w:t>
+      </w:r>
+    </w:p>
+    <w:bookmarkEnd w:id="34"/>
+    <w:bookmarkEnd w:id="35"/>
+    <w:bookmarkEnd w:id="36"/>
     <w:sectPr/>
   </w:body>
 </w:document>
@@ -1661,6 +2807,12 @@
     <w:abstractNumId w:val="991"/>
   </w:num>
   <w:num w:numId="1009">
+    <w:abstractNumId w:val="991"/>
+  </w:num>
+  <w:num w:numId="1010">
+    <w:abstractNumId w:val="991"/>
+  </w:num>
+  <w:num w:numId="1011">
     <w:abstractNumId w:val="991"/>
   </w:num>
 </w:numbering>

</xml_diff>